<commit_message>
Promote orange WeChat layouts to defaults
</commit_message>
<xml_diff>
--- a/content/wechat/foundation-models-and-inference/submodules/llm/推文终稿/大话大语言模型-它为什么能一句接一句.docx
+++ b/content/wechat/foundation-models-and-inference/submodules/llm/推文终稿/大话大语言模型-它为什么能一句接一句.docx
@@ -10,9 +10,11 @@
       <w:r>
         <w:rPr>
           <w:rFonts w:ascii="Hiragino Sans GB" w:hAnsi="Hiragino Sans GB" w:eastAsia="Hiragino Sans GB"/>
-          <w:sz w:val="50"/>
+          <w:b/>
+          <w:color w:val="20252B"/>
+          <w:sz w:val="37"/>
         </w:rPr>
-        <w:t>大话大语言模型：它为什么能一句接一句</w:t>
+        <w:t>大话大语言模型—它为什么能一句接一句</w:t>
       </w:r>
     </w:p>
     <w:p>
@@ -20,94 +22,19 @@
         <w:pStyle w:val="ArticleAuthor"/>
       </w:pPr>
       <w:r>
-        <w:t>作者：三色堇絮絮念</w:t>
-      </w:r>
-    </w:p>
-    <w:p>
-      <w:pPr>
-        <w:pStyle w:val="ArticleDigest"/>
-      </w:pPr>
-      <w:r>
-        <w:t>借一条会议改期通知，看懂 token、注意力、上下文、采样，以及模型什么时候会写得像却写不对。</w:t>
-      </w:r>
-    </w:p>
-    <w:p>
-      <w:pPr>
-        <w:keepNext w:val="0"/>
-        <w:spacing w:before="140" w:after="100"/>
-        <w:jc w:val="center"/>
-      </w:pPr>
-      <w:r>
-        <w:drawing>
-          <wp:inline xmlns:a="http://schemas.openxmlformats.org/drawingml/2006/main" xmlns:pic="http://schemas.openxmlformats.org/drawingml/2006/picture">
-            <wp:extent cx="6236208" cy="4157472"/>
-            <wp:docPr id="1" name="Picture 1" descr="大语言模型子模块封面" title="大语言模型子模块封面"/>
-            <wp:cNvGraphicFramePr>
-              <a:graphicFrameLocks noChangeAspect="1"/>
-            </wp:cNvGraphicFramePr>
-            <a:graphic>
-              <a:graphicData uri="http://schemas.openxmlformats.org/drawingml/2006/picture">
-                <pic:pic>
-                  <pic:nvPicPr>
-                    <pic:cNvPr id="0" name="llm-cover.png"/>
-                    <pic:cNvPicPr/>
-                  </pic:nvPicPr>
-                  <pic:blipFill>
-                    <a:blip r:embed="rId9"/>
-                    <a:stretch>
-                      <a:fillRect/>
-                    </a:stretch>
-                  </pic:blipFill>
-                  <pic:spPr>
-                    <a:xfrm>
-                      <a:off x="0" y="0"/>
-                      <a:ext cx="6236208" cy="4157472"/>
-                    </a:xfrm>
-                    <a:prstGeom prst="rect"/>
-                  </pic:spPr>
-                </pic:pic>
-              </a:graphicData>
-            </a:graphic>
-          </wp:inline>
-        </w:drawing>
+        <w:rPr>
+          <w:rFonts w:ascii="Hiragino Sans GB" w:hAnsi="Hiragino Sans GB" w:eastAsia="Hiragino Sans GB"/>
+          <w:color w:val="888888"/>
+          <w:sz w:val="21"/>
+        </w:rPr>
+        <w:t>原创：三色堇</w:t>
       </w:r>
     </w:p>
     <w:p>
       <w:pPr>
         <w:widowControl/>
-        <w:spacing w:before="0" w:after="140" w:line="355" w:lineRule="auto"/>
-        <w:ind w:firstLine="440"/>
-      </w:pPr>
-      <w:r>
-        <w:rPr>
-          <w:rFonts w:ascii="Hiragino Sans GB" w:hAnsi="Hiragino Sans GB" w:eastAsia="Hiragino Sans GB"/>
-          <w:sz w:val="22"/>
-        </w:rPr>
-        <w:t>项目入口：</w:t>
-      </w:r>
-      <w:hyperlink r:id="rId10">
-        <w:r>
-          <w:rPr>
-            <w:color w:val="1769AA"/>
-            <w:u w:val="single"/>
-            <w:rFonts w:ascii="Hiragino Sans GB" w:hAnsi="Hiragino Sans GB" w:eastAsia="Hiragino Sans GB"/>
-          </w:rPr>
-          <w:t>AI Agent 知识图谱仓库</w:t>
-        </w:r>
-      </w:hyperlink>
-      <w:r>
-        <w:rPr>
-          <w:rFonts w:ascii="Hiragino Sans GB" w:hAnsi="Hiragino Sans GB" w:eastAsia="Hiragino Sans GB"/>
-          <w:sz w:val="22"/>
-        </w:rPr>
-        <w:t>。项目按总览、初学者图解和面试题组织内容；本篇聚焦大语言模型怎样生成与核对文字。</w:t>
-      </w:r>
-    </w:p>
-    <w:p>
-      <w:pPr>
-        <w:widowControl/>
-        <w:spacing w:before="0" w:after="140" w:line="355" w:lineRule="auto"/>
-        <w:ind w:firstLine="440"/>
+        <w:spacing w:before="0" w:after="180" w:line="420" w:lineRule="auto"/>
+        <w:jc w:val="both"/>
       </w:pPr>
       <w:r>
         <w:rPr>
@@ -150,8 +77,8 @@
     <w:p>
       <w:pPr>
         <w:widowControl/>
-        <w:spacing w:before="0" w:after="140" w:line="355" w:lineRule="auto"/>
-        <w:ind w:firstLine="440"/>
+        <w:spacing w:before="0" w:after="180" w:line="420" w:lineRule="auto"/>
+        <w:jc w:val="both"/>
       </w:pPr>
       <w:r>
         <w:rPr>
@@ -168,7 +95,9 @@
       <w:r>
         <w:rPr>
           <w:rFonts w:ascii="Hiragino Sans GB" w:hAnsi="Hiragino Sans GB" w:eastAsia="Hiragino Sans GB"/>
-          <w:sz w:val="29"/>
+          <w:b/>
+          <w:color w:val="C85D12"/>
+          <w:sz w:val="30"/>
         </w:rPr>
         <w:t>一、它读到的文字，先被拆成什么</w:t>
       </w:r>
@@ -176,8 +105,8 @@
     <w:p>
       <w:pPr>
         <w:widowControl/>
-        <w:spacing w:before="0" w:after="140" w:line="355" w:lineRule="auto"/>
-        <w:ind w:firstLine="440"/>
+        <w:spacing w:before="0" w:after="180" w:line="420" w:lineRule="auto"/>
+        <w:jc w:val="both"/>
       </w:pPr>
       <w:r>
         <w:rPr>
@@ -204,8 +133,9 @@
       <w:r>
         <w:rPr>
           <w:rFonts w:ascii="Menlo" w:hAnsi="Menlo" w:eastAsia="Menlo"/>
-          <w:color w:val="253858"/>
+          <w:color w:val="C85D12"/>
           <w:sz w:val="21"/>
+          <w:shd w:val="clear" w:color="auto" w:fill="FFF3E6"/>
         </w:rPr>
         <w:t>token</w:t>
       </w:r>
@@ -219,8 +149,9 @@
       <w:r>
         <w:rPr>
           <w:rFonts w:ascii="Menlo" w:hAnsi="Menlo" w:eastAsia="Menlo"/>
-          <w:color w:val="253858"/>
+          <w:color w:val="C85D12"/>
           <w:sz w:val="21"/>
+          <w:shd w:val="clear" w:color="auto" w:fill="FFF3E6"/>
         </w:rPr>
         <w:t>token</w:t>
       </w:r>
@@ -241,8 +172,8 @@
       <w:r>
         <w:drawing>
           <wp:inline xmlns:a="http://schemas.openxmlformats.org/drawingml/2006/main" xmlns:pic="http://schemas.openxmlformats.org/drawingml/2006/picture">
-            <wp:extent cx="6236208" cy="4157472"/>
-            <wp:docPr id="2" name="Picture 2" descr="大语言模型的 token 生成循环" title="大语言模型的 token 生成循环"/>
+            <wp:extent cx="5989320" cy="3992879"/>
+            <wp:docPr id="1" name="Picture 1" descr="大语言模型的 token 生成循环" title="大语言模型的 token 生成循环"/>
             <wp:cNvGraphicFramePr>
               <a:graphicFrameLocks noChangeAspect="1"/>
             </wp:cNvGraphicFramePr>
@@ -254,7 +185,7 @@
                     <pic:cNvPicPr/>
                   </pic:nvPicPr>
                   <pic:blipFill>
-                    <a:blip r:embed="rId11"/>
+                    <a:blip r:embed="rId9"/>
                     <a:stretch>
                       <a:fillRect/>
                     </a:stretch>
@@ -262,7 +193,7 @@
                   <pic:spPr>
                     <a:xfrm>
                       <a:off x="0" y="0"/>
-                      <a:ext cx="6236208" cy="4157472"/>
+                      <a:ext cx="5989320" cy="3992879"/>
                     </a:xfrm>
                     <a:prstGeom prst="rect"/>
                   </pic:spPr>
@@ -276,8 +207,8 @@
     <w:p>
       <w:pPr>
         <w:widowControl/>
-        <w:spacing w:before="0" w:after="140" w:line="355" w:lineRule="auto"/>
-        <w:ind w:firstLine="440"/>
+        <w:spacing w:before="0" w:after="180" w:line="420" w:lineRule="auto"/>
+        <w:jc w:val="both"/>
       </w:pPr>
       <w:r>
         <w:rPr>
@@ -289,8 +220,9 @@
       <w:r>
         <w:rPr>
           <w:rFonts w:ascii="Menlo" w:hAnsi="Menlo" w:eastAsia="Menlo"/>
-          <w:color w:val="253858"/>
+          <w:color w:val="C85D12"/>
           <w:sz w:val="21"/>
+          <w:shd w:val="clear" w:color="auto" w:fill="FFF3E6"/>
         </w:rPr>
         <w:t>16:00—17:00</w:t>
       </w:r>
@@ -305,8 +237,8 @@
     <w:p>
       <w:pPr>
         <w:widowControl/>
-        <w:spacing w:before="0" w:after="140" w:line="355" w:lineRule="auto"/>
-        <w:ind w:firstLine="440"/>
+        <w:spacing w:before="0" w:after="180" w:line="420" w:lineRule="auto"/>
+        <w:jc w:val="both"/>
       </w:pPr>
       <w:r>
         <w:rPr>
@@ -318,8 +250,9 @@
       <w:r>
         <w:rPr>
           <w:rFonts w:ascii="Menlo" w:hAnsi="Menlo" w:eastAsia="Menlo"/>
-          <w:color w:val="253858"/>
+          <w:color w:val="C85D12"/>
           <w:sz w:val="21"/>
+          <w:shd w:val="clear" w:color="auto" w:fill="FFF3E6"/>
         </w:rPr>
         <w:t>token</w:t>
       </w:r>
@@ -338,7 +271,9 @@
       <w:r>
         <w:rPr>
           <w:rFonts w:ascii="Hiragino Sans GB" w:hAnsi="Hiragino Sans GB" w:eastAsia="Hiragino Sans GB"/>
-          <w:sz w:val="29"/>
+          <w:b/>
+          <w:color w:val="C85D12"/>
+          <w:sz w:val="30"/>
         </w:rPr>
         <w:t>二、它为什么能把一句话接着写下去</w:t>
       </w:r>
@@ -346,8 +281,8 @@
     <w:p>
       <w:pPr>
         <w:widowControl/>
-        <w:spacing w:before="0" w:after="140" w:line="355" w:lineRule="auto"/>
-        <w:ind w:firstLine="440"/>
+        <w:spacing w:before="0" w:after="180" w:line="420" w:lineRule="auto"/>
+        <w:jc w:val="both"/>
       </w:pPr>
       <w:r>
         <w:rPr>
@@ -374,8 +309,9 @@
       <w:r>
         <w:rPr>
           <w:rFonts w:ascii="Menlo" w:hAnsi="Menlo" w:eastAsia="Menlo"/>
-          <w:color w:val="253858"/>
+          <w:color w:val="C85D12"/>
           <w:sz w:val="21"/>
+          <w:shd w:val="clear" w:color="auto" w:fill="FFF3E6"/>
         </w:rPr>
         <w:t>token</w:t>
       </w:r>
@@ -390,8 +326,8 @@
     <w:p>
       <w:pPr>
         <w:widowControl/>
-        <w:spacing w:before="0" w:after="140" w:line="355" w:lineRule="auto"/>
-        <w:ind w:firstLine="440"/>
+        <w:spacing w:before="0" w:after="180" w:line="420" w:lineRule="auto"/>
+        <w:jc w:val="both"/>
       </w:pPr>
       <w:r>
         <w:rPr>
@@ -419,8 +355,8 @@
     <w:p>
       <w:pPr>
         <w:widowControl/>
-        <w:spacing w:before="0" w:after="140" w:line="355" w:lineRule="auto"/>
-        <w:ind w:firstLine="440"/>
+        <w:spacing w:before="0" w:after="180" w:line="420" w:lineRule="auto"/>
+        <w:jc w:val="both"/>
       </w:pPr>
       <w:r>
         <w:rPr>
@@ -437,7 +373,9 @@
       <w:r>
         <w:rPr>
           <w:rFonts w:ascii="Hiragino Sans GB" w:hAnsi="Hiragino Sans GB" w:eastAsia="Hiragino Sans GB"/>
-          <w:sz w:val="29"/>
+          <w:b/>
+          <w:color w:val="C85D12"/>
+          <w:sz w:val="30"/>
         </w:rPr>
         <w:t>三、它怎样把旧日程与新要求联系起来</w:t>
       </w:r>
@@ -445,14 +383,15 @@
     <w:p>
       <w:pPr>
         <w:widowControl/>
-        <w:spacing w:before="0" w:after="140" w:line="355" w:lineRule="auto"/>
-        <w:ind w:firstLine="440"/>
+        <w:spacing w:before="0" w:after="180" w:line="420" w:lineRule="auto"/>
+        <w:jc w:val="both"/>
       </w:pPr>
       <w:r>
         <w:rPr>
           <w:rFonts w:ascii="Menlo" w:hAnsi="Menlo" w:eastAsia="Menlo"/>
-          <w:color w:val="253858"/>
+          <w:color w:val="C85D12"/>
           <w:sz w:val="21"/>
+          <w:shd w:val="clear" w:color="auto" w:fill="FFF3E6"/>
         </w:rPr>
         <w:t>Transformer</w:t>
       </w:r>
@@ -481,8 +420,9 @@
       <w:r>
         <w:rPr>
           <w:rFonts w:ascii="Menlo" w:hAnsi="Menlo" w:eastAsia="Menlo"/>
-          <w:color w:val="253858"/>
+          <w:color w:val="C85D12"/>
           <w:sz w:val="21"/>
+          <w:shd w:val="clear" w:color="auto" w:fill="FFF3E6"/>
         </w:rPr>
         <w:t>Query</w:t>
       </w:r>
@@ -496,8 +436,9 @@
       <w:r>
         <w:rPr>
           <w:rFonts w:ascii="Menlo" w:hAnsi="Menlo" w:eastAsia="Menlo"/>
-          <w:color w:val="253858"/>
+          <w:color w:val="C85D12"/>
           <w:sz w:val="21"/>
+          <w:shd w:val="clear" w:color="auto" w:fill="FFF3E6"/>
         </w:rPr>
         <w:t>Key</w:t>
       </w:r>
@@ -511,8 +452,9 @@
       <w:r>
         <w:rPr>
           <w:rFonts w:ascii="Menlo" w:hAnsi="Menlo" w:eastAsia="Menlo"/>
-          <w:color w:val="253858"/>
+          <w:color w:val="C85D12"/>
           <w:sz w:val="21"/>
+          <w:shd w:val="clear" w:color="auto" w:fill="FFF3E6"/>
         </w:rPr>
         <w:t>Value</w:t>
       </w:r>
@@ -533,8 +475,8 @@
       <w:r>
         <w:drawing>
           <wp:inline xmlns:a="http://schemas.openxmlformats.org/drawingml/2006/main" xmlns:pic="http://schemas.openxmlformats.org/drawingml/2006/picture">
-            <wp:extent cx="6236208" cy="4157472"/>
-            <wp:docPr id="3" name="Picture 3" descr="自注意力从 Q、K、V 到当前表示" title="自注意力从 Q、K、V 到当前表示"/>
+            <wp:extent cx="5989320" cy="3992879"/>
+            <wp:docPr id="2" name="Picture 2" descr="自注意力从 Q、K、V 到当前表示" title="自注意力从 Q、K、V 到当前表示"/>
             <wp:cNvGraphicFramePr>
               <a:graphicFrameLocks noChangeAspect="1"/>
             </wp:cNvGraphicFramePr>
@@ -546,7 +488,7 @@
                     <pic:cNvPicPr/>
                   </pic:nvPicPr>
                   <pic:blipFill>
-                    <a:blip r:embed="rId12"/>
+                    <a:blip r:embed="rId10"/>
                     <a:stretch>
                       <a:fillRect/>
                     </a:stretch>
@@ -554,7 +496,7 @@
                   <pic:spPr>
                     <a:xfrm>
                       <a:off x="0" y="0"/>
-                      <a:ext cx="6236208" cy="4157472"/>
+                      <a:ext cx="5989320" cy="3992879"/>
                     </a:xfrm>
                     <a:prstGeom prst="rect"/>
                   </pic:spPr>
@@ -574,8 +516,8 @@
       <w:r>
         <w:rPr>
           <w:rFonts w:ascii="Hiragino Sans GB" w:hAnsi="Hiragino Sans GB" w:eastAsia="Hiragino Sans GB"/>
-          <w:i/>
-          <w:color w:val="8A8A8A"/>
+          <w:i w:val="0"/>
+          <w:color w:val="888888"/>
           <w:sz w:val="19"/>
         </w:rPr>
         <w:t>依据 Vaswani 等人的《Attention Is All You Need》Figure 2 与第 3.2.3 节改绘。</w:t>
@@ -584,8 +526,8 @@
     <w:p>
       <w:pPr>
         <w:widowControl/>
-        <w:spacing w:before="0" w:after="140" w:line="355" w:lineRule="auto"/>
-        <w:ind w:firstLine="440"/>
+        <w:spacing w:before="0" w:after="180" w:line="420" w:lineRule="auto"/>
+        <w:jc w:val="both"/>
       </w:pPr>
       <w:r>
         <w:rPr>
@@ -619,8 +561,8 @@
       <w:r>
         <w:drawing>
           <wp:inline xmlns:a="http://schemas.openxmlformats.org/drawingml/2006/main" xmlns:pic="http://schemas.openxmlformats.org/drawingml/2006/picture">
-            <wp:extent cx="6236208" cy="4157472"/>
-            <wp:docPr id="4" name="Picture 4" descr="RNN 与自注意力处理输入的差别" title="RNN 与自注意力处理输入的差别"/>
+            <wp:extent cx="5989320" cy="3992879"/>
+            <wp:docPr id="3" name="Picture 3" descr="RNN 与自注意力处理输入的差别" title="RNN 与自注意力处理输入的差别"/>
             <wp:cNvGraphicFramePr>
               <a:graphicFrameLocks noChangeAspect="1"/>
             </wp:cNvGraphicFramePr>
@@ -632,7 +574,7 @@
                     <pic:cNvPicPr/>
                   </pic:nvPicPr>
                   <pic:blipFill>
-                    <a:blip r:embed="rId13"/>
+                    <a:blip r:embed="rId11"/>
                     <a:stretch>
                       <a:fillRect/>
                     </a:stretch>
@@ -640,7 +582,7 @@
                   <pic:spPr>
                     <a:xfrm>
                       <a:off x="0" y="0"/>
-                      <a:ext cx="6236208" cy="4157472"/>
+                      <a:ext cx="5989320" cy="3992879"/>
                     </a:xfrm>
                     <a:prstGeom prst="rect"/>
                   </pic:spPr>
@@ -660,8 +602,8 @@
       <w:r>
         <w:rPr>
           <w:rFonts w:ascii="Hiragino Sans GB" w:hAnsi="Hiragino Sans GB" w:eastAsia="Hiragino Sans GB"/>
-          <w:i/>
-          <w:color w:val="8A8A8A"/>
+          <w:i w:val="0"/>
+          <w:color w:val="888888"/>
           <w:sz w:val="19"/>
         </w:rPr>
         <w:t>依据原论文第 4 节与 Table 1 改绘。图中比较的是同一层输入的计算；模型逐步生成通知时，仍是一次接一个 `token`。</w:t>
@@ -670,8 +612,8 @@
     <w:p>
       <w:pPr>
         <w:widowControl/>
-        <w:spacing w:before="0" w:after="140" w:line="355" w:lineRule="auto"/>
-        <w:ind w:firstLine="440"/>
+        <w:spacing w:before="0" w:after="180" w:line="420" w:lineRule="auto"/>
+        <w:jc w:val="both"/>
       </w:pPr>
       <w:r>
         <w:rPr>
@@ -718,7 +660,9 @@
       <w:r>
         <w:rPr>
           <w:rFonts w:ascii="Hiragino Sans GB" w:hAnsi="Hiragino Sans GB" w:eastAsia="Hiragino Sans GB"/>
-          <w:sz w:val="29"/>
+          <w:b/>
+          <w:color w:val="C85D12"/>
+          <w:sz w:val="30"/>
         </w:rPr>
         <w:t>四、材料都放进上下文，为什么还会看漏</w:t>
       </w:r>
@@ -726,8 +670,8 @@
     <w:p>
       <w:pPr>
         <w:widowControl/>
-        <w:spacing w:before="0" w:after="140" w:line="355" w:lineRule="auto"/>
-        <w:ind w:firstLine="440"/>
+        <w:spacing w:before="0" w:after="180" w:line="420" w:lineRule="auto"/>
+        <w:jc w:val="both"/>
       </w:pPr>
       <w:r>
         <w:rPr>
@@ -747,8 +691,9 @@
       <w:r>
         <w:rPr>
           <w:rFonts w:ascii="Menlo" w:hAnsi="Menlo" w:eastAsia="Menlo"/>
-          <w:color w:val="253858"/>
+          <w:color w:val="C85D12"/>
           <w:sz w:val="21"/>
+          <w:shd w:val="clear" w:color="auto" w:fill="FFF3E6"/>
         </w:rPr>
         <w:t>token</w:t>
       </w:r>
@@ -763,8 +708,8 @@
     <w:p>
       <w:pPr>
         <w:widowControl/>
-        <w:spacing w:before="0" w:after="140" w:line="355" w:lineRule="auto"/>
-        <w:ind w:firstLine="440"/>
+        <w:spacing w:before="0" w:after="180" w:line="420" w:lineRule="auto"/>
+        <w:jc w:val="both"/>
       </w:pPr>
       <w:r>
         <w:rPr>
@@ -777,8 +722,8 @@
     <w:p>
       <w:pPr>
         <w:widowControl/>
-        <w:spacing w:before="0" w:after="140" w:line="355" w:lineRule="auto"/>
-        <w:ind w:firstLine="440"/>
+        <w:spacing w:before="0" w:after="180" w:line="420" w:lineRule="auto"/>
+        <w:jc w:val="both"/>
       </w:pPr>
       <w:r>
         <w:rPr>
@@ -790,8 +735,9 @@
       <w:r>
         <w:rPr>
           <w:rFonts w:ascii="Menlo" w:hAnsi="Menlo" w:eastAsia="Menlo"/>
-          <w:color w:val="253858"/>
+          <w:color w:val="C85D12"/>
           <w:sz w:val="21"/>
+          <w:shd w:val="clear" w:color="auto" w:fill="FFF3E6"/>
         </w:rPr>
         <w:t>16:00—17:00</w:t>
       </w:r>
@@ -805,8 +751,9 @@
       <w:r>
         <w:rPr>
           <w:rFonts w:ascii="Menlo" w:hAnsi="Menlo" w:eastAsia="Menlo"/>
-          <w:color w:val="253858"/>
+          <w:color w:val="C85D12"/>
           <w:sz w:val="21"/>
+          <w:shd w:val="clear" w:color="auto" w:fill="FFF3E6"/>
         </w:rPr>
         <w:t>线上</w:t>
       </w:r>
@@ -820,8 +767,9 @@
       <w:r>
         <w:rPr>
           <w:rFonts w:ascii="Menlo" w:hAnsi="Menlo" w:eastAsia="Menlo"/>
-          <w:color w:val="253858"/>
+          <w:color w:val="C85D12"/>
           <w:sz w:val="21"/>
+          <w:shd w:val="clear" w:color="auto" w:fill="FFF3E6"/>
         </w:rPr>
         <w:t>链接待补</w:t>
       </w:r>
@@ -835,8 +783,9 @@
       <w:r>
         <w:rPr>
           <w:rFonts w:ascii="Menlo" w:hAnsi="Menlo" w:eastAsia="Menlo"/>
-          <w:color w:val="253858"/>
+          <w:color w:val="C85D12"/>
           <w:sz w:val="21"/>
+          <w:shd w:val="clear" w:color="auto" w:fill="FFF3E6"/>
         </w:rPr>
         <w:t>仅草稿</w:t>
       </w:r>
@@ -855,7 +804,9 @@
       <w:r>
         <w:rPr>
           <w:rFonts w:ascii="Hiragino Sans GB" w:hAnsi="Hiragino Sans GB" w:eastAsia="Hiragino Sans GB"/>
-          <w:sz w:val="29"/>
+          <w:b/>
+          <w:color w:val="C85D12"/>
+          <w:sz w:val="30"/>
         </w:rPr>
         <w:t>五、候选文字如何变成最后的措辞</w:t>
       </w:r>
@@ -863,8 +814,8 @@
     <w:p>
       <w:pPr>
         <w:widowControl/>
-        <w:spacing w:before="0" w:after="140" w:line="355" w:lineRule="auto"/>
-        <w:ind w:firstLine="440"/>
+        <w:spacing w:before="0" w:after="180" w:line="420" w:lineRule="auto"/>
+        <w:jc w:val="both"/>
       </w:pPr>
       <w:r>
         <w:rPr>
@@ -891,8 +842,9 @@
       <w:r>
         <w:rPr>
           <w:rFonts w:ascii="Menlo" w:hAnsi="Menlo" w:eastAsia="Menlo"/>
-          <w:color w:val="253858"/>
+          <w:color w:val="C85D12"/>
           <w:sz w:val="21"/>
+          <w:shd w:val="clear" w:color="auto" w:fill="FFF3E6"/>
         </w:rPr>
         <w:t>temperature</w:t>
       </w:r>
@@ -906,8 +858,9 @@
       <w:r>
         <w:rPr>
           <w:rFonts w:ascii="Menlo" w:hAnsi="Menlo" w:eastAsia="Menlo"/>
-          <w:color w:val="253858"/>
+          <w:color w:val="C85D12"/>
           <w:sz w:val="21"/>
+          <w:shd w:val="clear" w:color="auto" w:fill="FFF3E6"/>
         </w:rPr>
         <w:t>Top-k</w:t>
       </w:r>
@@ -921,8 +874,9 @@
       <w:r>
         <w:rPr>
           <w:rFonts w:ascii="Menlo" w:hAnsi="Menlo" w:eastAsia="Menlo"/>
-          <w:color w:val="253858"/>
+          <w:color w:val="C85D12"/>
           <w:sz w:val="21"/>
+          <w:shd w:val="clear" w:color="auto" w:fill="FFF3E6"/>
         </w:rPr>
         <w:t>Top-p</w:t>
       </w:r>
@@ -943,8 +897,8 @@
       <w:r>
         <w:drawing>
           <wp:inline xmlns:a="http://schemas.openxmlformats.org/drawingml/2006/main" xmlns:pic="http://schemas.openxmlformats.org/drawingml/2006/picture">
-            <wp:extent cx="6236208" cy="4157472"/>
-            <wp:docPr id="5" name="Picture 5" descr="解码参数怎样影响候选范围" title="解码参数怎样影响候选范围"/>
+            <wp:extent cx="5989320" cy="3992879"/>
+            <wp:docPr id="4" name="Picture 4" descr="解码参数怎样影响候选范围" title="解码参数怎样影响候选范围"/>
             <wp:cNvGraphicFramePr>
               <a:graphicFrameLocks noChangeAspect="1"/>
             </wp:cNvGraphicFramePr>
@@ -956,7 +910,7 @@
                     <pic:cNvPicPr/>
                   </pic:nvPicPr>
                   <pic:blipFill>
-                    <a:blip r:embed="rId14"/>
+                    <a:blip r:embed="rId12"/>
                     <a:stretch>
                       <a:fillRect/>
                     </a:stretch>
@@ -964,7 +918,7 @@
                   <pic:spPr>
                     <a:xfrm>
                       <a:off x="0" y="0"/>
-                      <a:ext cx="6236208" cy="4157472"/>
+                      <a:ext cx="5989320" cy="3992879"/>
                     </a:xfrm>
                     <a:prstGeom prst="rect"/>
                   </pic:spPr>
@@ -978,8 +932,8 @@
     <w:p>
       <w:pPr>
         <w:widowControl/>
-        <w:spacing w:before="0" w:after="140" w:line="355" w:lineRule="auto"/>
-        <w:ind w:firstLine="440"/>
+        <w:spacing w:before="0" w:after="180" w:line="420" w:lineRule="auto"/>
+        <w:jc w:val="both"/>
       </w:pPr>
       <w:r>
         <w:rPr>
@@ -992,8 +946,8 @@
     <w:p>
       <w:pPr>
         <w:widowControl/>
-        <w:spacing w:before="0" w:after="140" w:line="355" w:lineRule="auto"/>
-        <w:ind w:firstLine="440"/>
+        <w:spacing w:before="0" w:after="180" w:line="420" w:lineRule="auto"/>
+        <w:jc w:val="both"/>
       </w:pPr>
       <w:r>
         <w:rPr>
@@ -1010,7 +964,9 @@
       <w:r>
         <w:rPr>
           <w:rFonts w:ascii="Hiragino Sans GB" w:hAnsi="Hiragino Sans GB" w:eastAsia="Hiragino Sans GB"/>
-          <w:sz w:val="29"/>
+          <w:b/>
+          <w:color w:val="C85D12"/>
+          <w:sz w:val="30"/>
         </w:rPr>
         <w:t>六、为什么一句流畅的话仍可能是错的</w:t>
       </w:r>
@@ -1018,8 +974,8 @@
     <w:p>
       <w:pPr>
         <w:widowControl/>
-        <w:spacing w:before="0" w:after="140" w:line="355" w:lineRule="auto"/>
-        <w:ind w:firstLine="440"/>
+        <w:spacing w:before="0" w:after="180" w:line="420" w:lineRule="auto"/>
+        <w:jc w:val="both"/>
       </w:pPr>
       <w:r>
         <w:rPr>
@@ -1053,8 +1009,8 @@
       <w:r>
         <w:drawing>
           <wp:inline xmlns:a="http://schemas.openxmlformats.org/drawingml/2006/main" xmlns:pic="http://schemas.openxmlformats.org/drawingml/2006/picture">
-            <wp:extent cx="6236208" cy="4157472"/>
-            <wp:docPr id="6" name="Picture 6" descr="大语言模型可靠性护栏" title="大语言模型可靠性护栏"/>
+            <wp:extent cx="5989320" cy="3992879"/>
+            <wp:docPr id="5" name="Picture 5" descr="大语言模型可靠性护栏" title="大语言模型可靠性护栏"/>
             <wp:cNvGraphicFramePr>
               <a:graphicFrameLocks noChangeAspect="1"/>
             </wp:cNvGraphicFramePr>
@@ -1066,7 +1022,7 @@
                     <pic:cNvPicPr/>
                   </pic:nvPicPr>
                   <pic:blipFill>
-                    <a:blip r:embed="rId15"/>
+                    <a:blip r:embed="rId13"/>
                     <a:stretch>
                       <a:fillRect/>
                     </a:stretch>
@@ -1074,7 +1030,7 @@
                   <pic:spPr>
                     <a:xfrm>
                       <a:off x="0" y="0"/>
-                      <a:ext cx="6236208" cy="4157472"/>
+                      <a:ext cx="5989320" cy="3992879"/>
                     </a:xfrm>
                     <a:prstGeom prst="rect"/>
                   </pic:spPr>
@@ -1088,8 +1044,8 @@
     <w:p>
       <w:pPr>
         <w:widowControl/>
-        <w:spacing w:before="0" w:after="140" w:line="355" w:lineRule="auto"/>
-        <w:ind w:firstLine="440"/>
+        <w:spacing w:before="0" w:after="180" w:line="420" w:lineRule="auto"/>
+        <w:jc w:val="both"/>
       </w:pPr>
       <w:r>
         <w:rPr>
@@ -1147,8 +1103,8 @@
     <w:p>
       <w:pPr>
         <w:widowControl/>
-        <w:spacing w:before="0" w:after="140" w:line="355" w:lineRule="auto"/>
-        <w:ind w:firstLine="440"/>
+        <w:spacing w:before="0" w:after="180" w:line="420" w:lineRule="auto"/>
+        <w:jc w:val="both"/>
       </w:pPr>
       <w:r>
         <w:rPr>
@@ -1160,8 +1116,9 @@
       <w:r>
         <w:rPr>
           <w:rFonts w:ascii="Menlo" w:hAnsi="Menlo" w:eastAsia="Menlo"/>
-          <w:color w:val="253858"/>
+          <w:color w:val="C85D12"/>
           <w:sz w:val="21"/>
+          <w:shd w:val="clear" w:color="auto" w:fill="FFF3E6"/>
         </w:rPr>
         <w:t>16:00—17:00</w:t>
       </w:r>
@@ -1180,7 +1137,9 @@
       <w:r>
         <w:rPr>
           <w:rFonts w:ascii="Hiragino Sans GB" w:hAnsi="Hiragino Sans GB" w:eastAsia="Hiragino Sans GB"/>
-          <w:sz w:val="29"/>
+          <w:b/>
+          <w:color w:val="C85D12"/>
+          <w:sz w:val="30"/>
         </w:rPr>
         <w:t>七、怎样把草稿交给程序，而不让程序猜</w:t>
       </w:r>
@@ -1188,8 +1147,8 @@
     <w:p>
       <w:pPr>
         <w:widowControl/>
-        <w:spacing w:before="0" w:after="140" w:line="355" w:lineRule="auto"/>
-        <w:ind w:firstLine="440"/>
+        <w:spacing w:before="0" w:after="180" w:line="420" w:lineRule="auto"/>
+        <w:jc w:val="both"/>
       </w:pPr>
       <w:r>
         <w:rPr>
@@ -1216,93 +1175,38 @@
     </w:p>
     <w:p>
       <w:pPr>
-        <w:spacing w:before="80" w:after="80" w:line="240" w:lineRule="auto"/>
-        <w:ind w:left="504" w:right="288"/>
+        <w:keepLines/>
+        <w:spacing w:before="140" w:after="180" w:line="307" w:lineRule="auto"/>
+        <w:ind w:left="346" w:right="259"/>
+        <w:shd w:val="clear" w:color="auto" w:fill="FFF3E6"/>
+        <w:pBdr>
+          <w:left w:val="single" w:sz="20" w:space="8" w:color="E87522"/>
+        </w:pBdr>
       </w:pPr>
       <w:r>
         <w:rPr>
           <w:rFonts w:ascii="Menlo" w:hAnsi="Menlo" w:eastAsia="Menlo"/>
-          <w:color w:val="253858"/>
+          <w:color w:val="20252B"/>
           <w:sz w:val="19"/>
         </w:rPr>
         <w:t>{</w:t>
-      </w:r>
-    </w:p>
-    <w:p>
-      <w:pPr>
-        <w:spacing w:before="0" w:after="80" w:line="240" w:lineRule="auto"/>
-        <w:ind w:left="504" w:right="288"/>
-      </w:pPr>
-      <w:r>
-        <w:rPr>
-          <w:rFonts w:ascii="Menlo" w:hAnsi="Menlo" w:eastAsia="Menlo"/>
-          <w:color w:val="253858"/>
-          <w:sz w:val="19"/>
-        </w:rPr>
+        <w:br/>
         <w:t xml:space="preserve">  "time": "16:00-17:00",</w:t>
-      </w:r>
-    </w:p>
-    <w:p>
-      <w:pPr>
-        <w:spacing w:before="0" w:after="80" w:line="240" w:lineRule="auto"/>
-        <w:ind w:left="504" w:right="288"/>
-      </w:pPr>
-      <w:r>
-        <w:rPr>
-          <w:rFonts w:ascii="Menlo" w:hAnsi="Menlo" w:eastAsia="Menlo"/>
-          <w:color w:val="253858"/>
-          <w:sz w:val="19"/>
-        </w:rPr>
+        <w:br/>
         <w:t xml:space="preserve">  "mode": "线上",</w:t>
-      </w:r>
-    </w:p>
-    <w:p>
-      <w:pPr>
-        <w:spacing w:before="0" w:after="80" w:line="240" w:lineRule="auto"/>
-        <w:ind w:left="504" w:right="288"/>
-      </w:pPr>
-      <w:r>
-        <w:rPr>
-          <w:rFonts w:ascii="Menlo" w:hAnsi="Menlo" w:eastAsia="Menlo"/>
-          <w:color w:val="253858"/>
-          <w:sz w:val="19"/>
-        </w:rPr>
+        <w:br/>
         <w:t xml:space="preserve">  "link": null,</w:t>
-      </w:r>
-    </w:p>
-    <w:p>
-      <w:pPr>
-        <w:spacing w:before="0" w:after="80" w:line="240" w:lineRule="auto"/>
-        <w:ind w:left="504" w:right="288"/>
-      </w:pPr>
-      <w:r>
-        <w:rPr>
-          <w:rFonts w:ascii="Menlo" w:hAnsi="Menlo" w:eastAsia="Menlo"/>
-          <w:color w:val="253858"/>
-          <w:sz w:val="19"/>
-        </w:rPr>
+        <w:br/>
         <w:t xml:space="preserve">  "status": "draft_only"</w:t>
-      </w:r>
-    </w:p>
-    <w:p>
-      <w:pPr>
-        <w:spacing w:before="0" w:after="80" w:line="240" w:lineRule="auto"/>
-        <w:ind w:left="504" w:right="288"/>
-      </w:pPr>
-      <w:r>
-        <w:rPr>
-          <w:rFonts w:ascii="Menlo" w:hAnsi="Menlo" w:eastAsia="Menlo"/>
-          <w:color w:val="253858"/>
-          <w:sz w:val="19"/>
-        </w:rPr>
+        <w:br/>
         <w:t>}</w:t>
       </w:r>
     </w:p>
     <w:p>
       <w:pPr>
         <w:widowControl/>
-        <w:spacing w:before="0" w:after="140" w:line="355" w:lineRule="auto"/>
-        <w:ind w:firstLine="440"/>
+        <w:spacing w:before="0" w:after="180" w:line="420" w:lineRule="auto"/>
+        <w:jc w:val="both"/>
       </w:pPr>
       <w:r>
         <w:rPr>
@@ -1314,8 +1218,9 @@
       <w:r>
         <w:rPr>
           <w:rFonts w:ascii="Menlo" w:hAnsi="Menlo" w:eastAsia="Menlo"/>
-          <w:color w:val="253858"/>
+          <w:color w:val="C85D12"/>
           <w:sz w:val="21"/>
+          <w:shd w:val="clear" w:color="auto" w:fill="FFF3E6"/>
         </w:rPr>
         <w:t>link: null</w:t>
       </w:r>
@@ -1329,8 +1234,9 @@
       <w:r>
         <w:rPr>
           <w:rFonts w:ascii="Menlo" w:hAnsi="Menlo" w:eastAsia="Menlo"/>
-          <w:color w:val="253858"/>
+          <w:color w:val="C85D12"/>
           <w:sz w:val="21"/>
+          <w:shd w:val="clear" w:color="auto" w:fill="FFF3E6"/>
         </w:rPr>
         <w:t>draft_only</w:t>
       </w:r>
@@ -1359,10 +1265,18 @@
     </w:p>
     <w:p>
       <w:pPr>
-        <w:pStyle w:val="ListBullet"/>
-        <w:spacing w:after="100" w:line="341" w:lineRule="auto"/>
+        <w:spacing w:after="100" w:line="396" w:lineRule="auto"/>
         <w:ind w:left="504" w:hanging="259"/>
       </w:pPr>
+      <w:r>
+        <w:rPr>
+          <w:rFonts w:ascii="Hiragino Sans GB" w:hAnsi="Hiragino Sans GB" w:eastAsia="Hiragino Sans GB"/>
+          <w:b/>
+          <w:color w:val="E87522"/>
+          <w:sz w:val="22"/>
+        </w:rPr>
+        <w:t xml:space="preserve">• </w:t>
+      </w:r>
       <w:r>
         <w:rPr>
           <w:rFonts w:ascii="Hiragino Sans GB" w:hAnsi="Hiragino Sans GB" w:eastAsia="Hiragino Sans GB"/>
@@ -1381,8 +1295,9 @@
       <w:r>
         <w:rPr>
           <w:rFonts w:ascii="Menlo" w:hAnsi="Menlo" w:eastAsia="Menlo"/>
-          <w:color w:val="253858"/>
+          <w:color w:val="C85D12"/>
           <w:sz w:val="21"/>
+          <w:shd w:val="clear" w:color="auto" w:fill="FFF3E6"/>
         </w:rPr>
         <w:t>time</w:t>
       </w:r>
@@ -1396,8 +1311,9 @@
       <w:r>
         <w:rPr>
           <w:rFonts w:ascii="Menlo" w:hAnsi="Menlo" w:eastAsia="Menlo"/>
-          <w:color w:val="253858"/>
+          <w:color w:val="C85D12"/>
           <w:sz w:val="21"/>
+          <w:shd w:val="clear" w:color="auto" w:fill="FFF3E6"/>
         </w:rPr>
         <w:t>link</w:t>
       </w:r>
@@ -1411,10 +1327,18 @@
     </w:p>
     <w:p>
       <w:pPr>
-        <w:pStyle w:val="ListBullet"/>
-        <w:spacing w:after="100" w:line="341" w:lineRule="auto"/>
+        <w:spacing w:after="100" w:line="396" w:lineRule="auto"/>
         <w:ind w:left="504" w:hanging="259"/>
       </w:pPr>
+      <w:r>
+        <w:rPr>
+          <w:rFonts w:ascii="Hiragino Sans GB" w:hAnsi="Hiragino Sans GB" w:eastAsia="Hiragino Sans GB"/>
+          <w:b/>
+          <w:color w:val="E87522"/>
+          <w:sz w:val="22"/>
+        </w:rPr>
+        <w:t xml:space="preserve">• </w:t>
+      </w:r>
       <w:r>
         <w:rPr>
           <w:rFonts w:ascii="Hiragino Sans GB" w:hAnsi="Hiragino Sans GB" w:eastAsia="Hiragino Sans GB"/>
@@ -1433,8 +1357,9 @@
       <w:r>
         <w:rPr>
           <w:rFonts w:ascii="Menlo" w:hAnsi="Menlo" w:eastAsia="Menlo"/>
-          <w:color w:val="253858"/>
+          <w:color w:val="C85D12"/>
           <w:sz w:val="21"/>
+          <w:shd w:val="clear" w:color="auto" w:fill="FFF3E6"/>
         </w:rPr>
         <w:t>14:00</w:t>
       </w:r>
@@ -1448,8 +1373,9 @@
       <w:r>
         <w:rPr>
           <w:rFonts w:ascii="Menlo" w:hAnsi="Menlo" w:eastAsia="Menlo"/>
-          <w:color w:val="253858"/>
+          <w:color w:val="C85D12"/>
           <w:sz w:val="21"/>
+          <w:shd w:val="clear" w:color="auto" w:fill="FFF3E6"/>
         </w:rPr>
         <w:t>16:00</w:t>
       </w:r>
@@ -1463,10 +1389,18 @@
     </w:p>
     <w:p>
       <w:pPr>
-        <w:pStyle w:val="ListBullet"/>
-        <w:spacing w:after="100" w:line="341" w:lineRule="auto"/>
+        <w:spacing w:after="100" w:line="396" w:lineRule="auto"/>
         <w:ind w:left="504" w:hanging="259"/>
       </w:pPr>
+      <w:r>
+        <w:rPr>
+          <w:rFonts w:ascii="Hiragino Sans GB" w:hAnsi="Hiragino Sans GB" w:eastAsia="Hiragino Sans GB"/>
+          <w:b/>
+          <w:color w:val="E87522"/>
+          <w:sz w:val="22"/>
+        </w:rPr>
+        <w:t xml:space="preserve">• </w:t>
+      </w:r>
       <w:r>
         <w:rPr>
           <w:rFonts w:ascii="Hiragino Sans GB" w:hAnsi="Hiragino Sans GB" w:eastAsia="Hiragino Sans GB"/>
@@ -1486,8 +1420,8 @@
     <w:p>
       <w:pPr>
         <w:widowControl/>
-        <w:spacing w:before="0" w:after="140" w:line="355" w:lineRule="auto"/>
-        <w:ind w:firstLine="440"/>
+        <w:spacing w:before="0" w:after="180" w:line="420" w:lineRule="auto"/>
+        <w:jc w:val="both"/>
       </w:pPr>
       <w:r>
         <w:rPr>
@@ -1499,8 +1433,9 @@
       <w:r>
         <w:rPr>
           <w:rFonts w:ascii="Menlo" w:hAnsi="Menlo" w:eastAsia="Menlo"/>
-          <w:color w:val="253858"/>
+          <w:color w:val="C85D12"/>
           <w:sz w:val="21"/>
+          <w:shd w:val="clear" w:color="auto" w:fill="FFF3E6"/>
         </w:rPr>
         <w:t>JSON</w:t>
       </w:r>
@@ -1515,8 +1450,8 @@
     <w:p>
       <w:pPr>
         <w:widowControl/>
-        <w:spacing w:before="0" w:after="140" w:line="355" w:lineRule="auto"/>
-        <w:ind w:firstLine="440"/>
+        <w:spacing w:before="0" w:after="180" w:line="420" w:lineRule="auto"/>
+        <w:jc w:val="both"/>
       </w:pPr>
       <w:r>
         <w:rPr>
@@ -1528,8 +1463,9 @@
       <w:r>
         <w:rPr>
           <w:rFonts w:ascii="Menlo" w:hAnsi="Menlo" w:eastAsia="Menlo"/>
-          <w:color w:val="253858"/>
+          <w:color w:val="C85D12"/>
           <w:sz w:val="21"/>
+          <w:shd w:val="clear" w:color="auto" w:fill="FFF3E6"/>
         </w:rPr>
         <w:t>needs_clarification</w:t>
       </w:r>
@@ -1548,7 +1484,9 @@
       <w:r>
         <w:rPr>
           <w:rFonts w:ascii="Hiragino Sans GB" w:hAnsi="Hiragino Sans GB" w:eastAsia="Hiragino Sans GB"/>
-          <w:sz w:val="29"/>
+          <w:b/>
+          <w:color w:val="C85D12"/>
+          <w:sz w:val="30"/>
         </w:rPr>
         <w:t>八、它为什么有时快，有时慢</w:t>
       </w:r>
@@ -1556,8 +1494,8 @@
     <w:p>
       <w:pPr>
         <w:widowControl/>
-        <w:spacing w:before="0" w:after="140" w:line="355" w:lineRule="auto"/>
-        <w:ind w:firstLine="440"/>
+        <w:spacing w:before="0" w:after="180" w:line="420" w:lineRule="auto"/>
+        <w:jc w:val="both"/>
       </w:pPr>
       <w:r>
         <w:rPr>
@@ -1600,8 +1538,8 @@
     <w:p>
       <w:pPr>
         <w:widowControl/>
-        <w:spacing w:before="0" w:after="140" w:line="355" w:lineRule="auto"/>
-        <w:ind w:firstLine="440"/>
+        <w:spacing w:before="0" w:after="180" w:line="420" w:lineRule="auto"/>
+        <w:jc w:val="both"/>
       </w:pPr>
       <w:r>
         <w:rPr>
@@ -1613,8 +1551,9 @@
       <w:r>
         <w:rPr>
           <w:rFonts w:ascii="Menlo" w:hAnsi="Menlo" w:eastAsia="Menlo"/>
-          <w:color w:val="253858"/>
+          <w:color w:val="C85D12"/>
           <w:sz w:val="21"/>
+          <w:shd w:val="clear" w:color="auto" w:fill="FFF3E6"/>
         </w:rPr>
         <w:t>KV Cache</w:t>
       </w:r>
@@ -1628,8 +1567,9 @@
       <w:r>
         <w:rPr>
           <w:rFonts w:ascii="Menlo" w:hAnsi="Menlo" w:eastAsia="Menlo"/>
-          <w:color w:val="253858"/>
+          <w:color w:val="C85D12"/>
           <w:sz w:val="21"/>
+          <w:shd w:val="clear" w:color="auto" w:fill="FFF3E6"/>
         </w:rPr>
         <w:t>token</w:t>
       </w:r>
@@ -1659,8 +1599,8 @@
     <w:p>
       <w:pPr>
         <w:widowControl/>
-        <w:spacing w:before="0" w:after="140" w:line="355" w:lineRule="auto"/>
-        <w:ind w:firstLine="440"/>
+        <w:spacing w:before="0" w:after="180" w:line="420" w:lineRule="auto"/>
+        <w:jc w:val="both"/>
       </w:pPr>
       <w:r>
         <w:rPr>
@@ -1672,8 +1612,9 @@
       <w:r>
         <w:rPr>
           <w:rFonts w:ascii="Menlo" w:hAnsi="Menlo" w:eastAsia="Menlo"/>
-          <w:color w:val="253858"/>
+          <w:color w:val="C85D12"/>
           <w:sz w:val="21"/>
+          <w:shd w:val="clear" w:color="auto" w:fill="FFF3E6"/>
         </w:rPr>
         <w:t>token</w:t>
       </w:r>
@@ -1687,8 +1628,9 @@
       <w:r>
         <w:rPr>
           <w:rFonts w:ascii="Menlo" w:hAnsi="Menlo" w:eastAsia="Menlo"/>
-          <w:color w:val="253858"/>
+          <w:color w:val="C85D12"/>
           <w:sz w:val="21"/>
+          <w:shd w:val="clear" w:color="auto" w:fill="FFF3E6"/>
         </w:rPr>
         <w:t>token</w:t>
       </w:r>
@@ -1702,8 +1644,9 @@
       <w:r>
         <w:rPr>
           <w:rFonts w:ascii="Menlo" w:hAnsi="Menlo" w:eastAsia="Menlo"/>
-          <w:color w:val="253858"/>
+          <w:color w:val="C85D12"/>
           <w:sz w:val="21"/>
+          <w:shd w:val="clear" w:color="auto" w:fill="FFF3E6"/>
         </w:rPr>
         <w:t>token</w:t>
       </w:r>
@@ -1722,7 +1665,9 @@
       <w:r>
         <w:rPr>
           <w:rFonts w:ascii="Hiragino Sans GB" w:hAnsi="Hiragino Sans GB" w:eastAsia="Hiragino Sans GB"/>
-          <w:sz w:val="29"/>
+          <w:b/>
+          <w:color w:val="C85D12"/>
+          <w:sz w:val="30"/>
         </w:rPr>
         <w:t>九、怎样知道这条通知真的写对了</w:t>
       </w:r>
@@ -1730,8 +1675,8 @@
     <w:p>
       <w:pPr>
         <w:widowControl/>
-        <w:spacing w:before="0" w:after="140" w:line="355" w:lineRule="auto"/>
-        <w:ind w:firstLine="440"/>
+        <w:spacing w:before="0" w:after="180" w:line="420" w:lineRule="auto"/>
+        <w:jc w:val="both"/>
       </w:pPr>
       <w:r>
         <w:rPr>
@@ -1759,8 +1704,8 @@
     <w:p>
       <w:pPr>
         <w:widowControl/>
-        <w:spacing w:before="0" w:after="140" w:line="355" w:lineRule="auto"/>
-        <w:ind w:firstLine="440"/>
+        <w:spacing w:before="0" w:after="180" w:line="420" w:lineRule="auto"/>
+        <w:jc w:val="both"/>
       </w:pPr>
       <w:r>
         <w:rPr>
@@ -1773,8 +1718,8 @@
     <w:p>
       <w:pPr>
         <w:widowControl/>
-        <w:spacing w:before="0" w:after="140" w:line="355" w:lineRule="auto"/>
-        <w:ind w:firstLine="440"/>
+        <w:spacing w:before="0" w:after="180" w:line="420" w:lineRule="auto"/>
+        <w:jc w:val="both"/>
       </w:pPr>
       <w:r>
         <w:rPr>
@@ -1786,8 +1731,9 @@
       <w:r>
         <w:rPr>
           <w:rFonts w:ascii="Menlo" w:hAnsi="Menlo" w:eastAsia="Menlo"/>
-          <w:color w:val="253858"/>
+          <w:color w:val="C85D12"/>
           <w:sz w:val="21"/>
+          <w:shd w:val="clear" w:color="auto" w:fill="FFF3E6"/>
         </w:rPr>
         <w:t>token</w:t>
       </w:r>
@@ -1809,25 +1755,149 @@
     </w:p>
     <w:p>
       <w:pPr>
+        <w:pStyle w:val="Heading2"/>
+      </w:pPr>
+      <w:r>
+        <w:rPr>
+          <w:rFonts w:ascii="Hiragino Sans GB" w:hAnsi="Hiragino Sans GB" w:eastAsia="Hiragino Sans GB"/>
+          <w:b/>
+          <w:color w:val="C85D12"/>
+          <w:sz w:val="30"/>
+        </w:rPr>
+        <w:t>参考资料</w:t>
+      </w:r>
+    </w:p>
+    <w:p>
+      <w:pPr>
+        <w:spacing w:after="40" w:line="324" w:lineRule="auto"/>
+        <w:ind w:left="504" w:hanging="259"/>
+      </w:pPr>
+      <w:r>
+        <w:rPr>
+          <w:rFonts w:ascii="Hiragino Sans GB" w:hAnsi="Hiragino Sans GB" w:eastAsia="Hiragino Sans GB"/>
+          <w:b/>
+          <w:color w:val="E87522"/>
+          <w:sz w:val="19"/>
+        </w:rPr>
+        <w:t xml:space="preserve">• </w:t>
+      </w:r>
+      <w:hyperlink r:id="rId14">
+        <w:r>
+          <w:rPr>
+            <w:color w:val="C85D12"/>
+            <w:u w:val="single"/>
+            <w:rFonts w:ascii="Hiragino Sans GB" w:hAnsi="Hiragino Sans GB" w:eastAsia="Hiragino Sans GB"/>
+            <w:sz w:val="19"/>
+            <w:szCs w:val="19"/>
+          </w:rPr>
+          <w:t>Attention Is All You Need</w:t>
+        </w:r>
+      </w:hyperlink>
+    </w:p>
+    <w:p>
+      <w:pPr>
+        <w:spacing w:after="40" w:line="324" w:lineRule="auto"/>
+        <w:ind w:left="504" w:hanging="259"/>
+      </w:pPr>
+      <w:r>
+        <w:rPr>
+          <w:rFonts w:ascii="Hiragino Sans GB" w:hAnsi="Hiragino Sans GB" w:eastAsia="Hiragino Sans GB"/>
+          <w:b/>
+          <w:color w:val="E87522"/>
+          <w:sz w:val="19"/>
+        </w:rPr>
+        <w:t xml:space="preserve">• </w:t>
+      </w:r>
+      <w:hyperlink r:id="rId15">
+        <w:r>
+          <w:rPr>
+            <w:color w:val="C85D12"/>
+            <w:u w:val="single"/>
+            <w:rFonts w:ascii="Hiragino Sans GB" w:hAnsi="Hiragino Sans GB" w:eastAsia="Hiragino Sans GB"/>
+            <w:sz w:val="19"/>
+            <w:szCs w:val="19"/>
+          </w:rPr>
+          <w:t>Lost in the Middle：How Language Models Use Long Contexts</w:t>
+        </w:r>
+      </w:hyperlink>
+    </w:p>
+    <w:p>
+      <w:pPr>
+        <w:spacing w:after="40" w:line="324" w:lineRule="auto"/>
+        <w:ind w:left="504" w:hanging="259"/>
+      </w:pPr>
+      <w:r>
+        <w:rPr>
+          <w:rFonts w:ascii="Hiragino Sans GB" w:hAnsi="Hiragino Sans GB" w:eastAsia="Hiragino Sans GB"/>
+          <w:b/>
+          <w:color w:val="E87522"/>
+          <w:sz w:val="19"/>
+        </w:rPr>
+        <w:t xml:space="preserve">• </w:t>
+      </w:r>
+      <w:hyperlink r:id="rId16">
+        <w:r>
+          <w:rPr>
+            <w:color w:val="C85D12"/>
+            <w:u w:val="single"/>
+            <w:rFonts w:ascii="Hiragino Sans GB" w:hAnsi="Hiragino Sans GB" w:eastAsia="Hiragino Sans GB"/>
+            <w:sz w:val="19"/>
+            <w:szCs w:val="19"/>
+          </w:rPr>
+          <w:t>The Curious Case of Neural Text Degeneration</w:t>
+        </w:r>
+      </w:hyperlink>
+    </w:p>
+    <w:p>
+      <w:pPr>
+        <w:spacing w:after="40" w:line="324" w:lineRule="auto"/>
+        <w:ind w:left="504" w:hanging="259"/>
+      </w:pPr>
+      <w:r>
+        <w:rPr>
+          <w:rFonts w:ascii="Hiragino Sans GB" w:hAnsi="Hiragino Sans GB" w:eastAsia="Hiragino Sans GB"/>
+          <w:b/>
+          <w:color w:val="E87522"/>
+          <w:sz w:val="19"/>
+        </w:rPr>
+        <w:t xml:space="preserve">• </w:t>
+      </w:r>
+      <w:hyperlink r:id="rId17">
+        <w:r>
+          <w:rPr>
+            <w:color w:val="C85D12"/>
+            <w:u w:val="single"/>
+            <w:rFonts w:ascii="Hiragino Sans GB" w:hAnsi="Hiragino Sans GB" w:eastAsia="Hiragino Sans GB"/>
+            <w:sz w:val="19"/>
+            <w:szCs w:val="19"/>
+          </w:rPr>
+          <w:t>Efficient Memory Management for Large Language Model Serving with PagedAttention</w:t>
+        </w:r>
+      </w:hyperlink>
+    </w:p>
+    <w:p>
+      <w:pPr>
         <w:widowControl/>
-        <w:spacing w:before="0" w:after="140" w:line="355" w:lineRule="auto"/>
-        <w:ind w:firstLine="440"/>
+        <w:spacing w:before="260" w:after="0" w:line="420" w:lineRule="auto"/>
+        <w:jc w:val="both"/>
       </w:pPr>
       <w:r>
         <w:rPr>
           <w:rFonts w:ascii="Hiragino Sans GB" w:hAnsi="Hiragino Sans GB" w:eastAsia="Hiragino Sans GB"/>
           <w:sz w:val="22"/>
         </w:rPr>
-        <w:t xml:space="preserve">想看它在 AI Agent 中的位置，可回到 </w:t>
+        <w:t xml:space="preserve">想看本文在 AI Agent 中的位置，可点击下方 </w:t>
       </w:r>
-      <w:hyperlink r:id="rId10">
+      <w:hyperlink r:id="rId18">
         <w:r>
           <w:rPr>
-            <w:color w:val="1769AA"/>
+            <w:color w:val="C85D12"/>
             <w:u w:val="single"/>
             <w:rFonts w:ascii="Hiragino Sans GB" w:hAnsi="Hiragino Sans GB" w:eastAsia="Hiragino Sans GB"/>
+            <w:sz w:val="22"/>
+            <w:szCs w:val="22"/>
           </w:rPr>
-          <w:t>项目总览仓库</w:t>
+          <w:t>阅读原文</w:t>
         </w:r>
       </w:hyperlink>
       <w:r>
@@ -1838,89 +1908,9 @@
         <w:t>，从“基础模型与推理”继续阅读。</w:t>
       </w:r>
     </w:p>
-    <w:p>
-      <w:pPr>
-        <w:pStyle w:val="Heading2"/>
-      </w:pPr>
-      <w:r>
-        <w:rPr>
-          <w:rFonts w:ascii="Hiragino Sans GB" w:hAnsi="Hiragino Sans GB" w:eastAsia="Hiragino Sans GB"/>
-          <w:sz w:val="29"/>
-        </w:rPr>
-        <w:t>参考资料</w:t>
-      </w:r>
-    </w:p>
-    <w:p>
-      <w:pPr>
-        <w:pStyle w:val="ListBullet"/>
-        <w:spacing w:after="40" w:line="276" w:lineRule="auto"/>
-        <w:ind w:left="504" w:hanging="259"/>
-      </w:pPr>
-      <w:hyperlink r:id="rId16">
-        <w:r>
-          <w:rPr>
-            <w:color w:val="1769AA"/>
-            <w:u w:val="single"/>
-            <w:rFonts w:ascii="Hiragino Sans GB" w:hAnsi="Hiragino Sans GB" w:eastAsia="Hiragino Sans GB"/>
-          </w:rPr>
-          <w:t>Attention Is All You Need</w:t>
-        </w:r>
-      </w:hyperlink>
-    </w:p>
-    <w:p>
-      <w:pPr>
-        <w:pStyle w:val="ListBullet"/>
-        <w:spacing w:after="40" w:line="276" w:lineRule="auto"/>
-        <w:ind w:left="504" w:hanging="259"/>
-      </w:pPr>
-      <w:hyperlink r:id="rId17">
-        <w:r>
-          <w:rPr>
-            <w:color w:val="1769AA"/>
-            <w:u w:val="single"/>
-            <w:rFonts w:ascii="Hiragino Sans GB" w:hAnsi="Hiragino Sans GB" w:eastAsia="Hiragino Sans GB"/>
-          </w:rPr>
-          <w:t>Lost in the Middle：How Language Models Use Long Contexts</w:t>
-        </w:r>
-      </w:hyperlink>
-    </w:p>
-    <w:p>
-      <w:pPr>
-        <w:pStyle w:val="ListBullet"/>
-        <w:spacing w:after="40" w:line="276" w:lineRule="auto"/>
-        <w:ind w:left="504" w:hanging="259"/>
-      </w:pPr>
-      <w:hyperlink r:id="rId18">
-        <w:r>
-          <w:rPr>
-            <w:color w:val="1769AA"/>
-            <w:u w:val="single"/>
-            <w:rFonts w:ascii="Hiragino Sans GB" w:hAnsi="Hiragino Sans GB" w:eastAsia="Hiragino Sans GB"/>
-          </w:rPr>
-          <w:t>The Curious Case of Neural Text Degeneration</w:t>
-        </w:r>
-      </w:hyperlink>
-    </w:p>
-    <w:p>
-      <w:pPr>
-        <w:pStyle w:val="ListBullet"/>
-        <w:spacing w:after="40" w:line="276" w:lineRule="auto"/>
-        <w:ind w:left="504" w:hanging="259"/>
-      </w:pPr>
-      <w:hyperlink r:id="rId19">
-        <w:r>
-          <w:rPr>
-            <w:color w:val="1769AA"/>
-            <w:u w:val="single"/>
-            <w:rFonts w:ascii="Hiragino Sans GB" w:hAnsi="Hiragino Sans GB" w:eastAsia="Hiragino Sans GB"/>
-          </w:rPr>
-          <w:t>Efficient Memory Management for Large Language Model Serving with PagedAttention</w:t>
-        </w:r>
-      </w:hyperlink>
-    </w:p>
     <w:sectPr>
       <w:pgSz w:w="12240" w:h="15840"/>
-      <w:pgMar w:top="1037" w:right="1181" w:bottom="1037" w:left="1181" w:header="720" w:footer="720" w:gutter="0"/>
+      <w:pgMar w:top="1037" w:right="1296" w:bottom="1037" w:left="1296" w:header="720" w:footer="720" w:gutter="0"/>
       <w:cols w:space="720"/>
       <w:docGrid w:linePitch="360"/>
     </w:sectPr>
@@ -2293,7 +2283,7 @@
     <w:rsid w:val="00FC693F"/>
     <w:rPr>
       <w:rFonts w:ascii="Hiragino Sans GB" w:hAnsi="Hiragino Sans GB" w:eastAsia="Hiragino Sans GB"/>
-      <w:color w:val="000000"/>
+      <w:color w:val="20252B"/>
       <w:sz w:val="22"/>
     </w:rPr>
   </w:style>
@@ -2352,14 +2342,14 @@
     <w:pPr>
       <w:keepNext/>
       <w:keepLines/>
-      <w:spacing w:before="360" w:after="160"/>
+      <w:spacing w:before="400" w:after="160"/>
       <w:outlineLvl w:val="0"/>
     </w:pPr>
     <w:rPr>
       <w:rFonts w:asciiTheme="majorHAnsi" w:eastAsiaTheme="majorEastAsia" w:hAnsiTheme="majorHAnsi" w:cstheme="majorBidi" w:ascii="Hiragino Sans GB" w:hAnsi="Hiragino Sans GB" w:eastAsia="Hiragino Sans GB"/>
       <w:b/>
       <w:bCs/>
-      <w:color w:val="000000"/>
+      <w:color w:val="C85D12"/>
       <w:sz w:val="34"/>
       <w:szCs w:val="28"/>
     </w:rPr>
@@ -2376,15 +2366,15 @@
     <w:pPr>
       <w:keepNext/>
       <w:keepLines/>
-      <w:spacing w:before="280" w:after="120"/>
+      <w:spacing w:before="360" w:after="140"/>
       <w:outlineLvl w:val="1"/>
     </w:pPr>
     <w:rPr>
       <w:rFonts w:asciiTheme="majorHAnsi" w:eastAsiaTheme="majorEastAsia" w:hAnsiTheme="majorHAnsi" w:cstheme="majorBidi" w:ascii="Hiragino Sans GB" w:hAnsi="Hiragino Sans GB" w:eastAsia="Hiragino Sans GB"/>
       <w:b/>
       <w:bCs/>
-      <w:color w:val="000000"/>
-      <w:sz w:val="29"/>
+      <w:color w:val="C85D12"/>
+      <w:sz w:val="30"/>
       <w:szCs w:val="26"/>
     </w:rPr>
   </w:style>
@@ -2400,14 +2390,14 @@
     <w:pPr>
       <w:keepNext/>
       <w:keepLines/>
-      <w:spacing w:before="200" w:after="80"/>
+      <w:spacing w:before="240" w:after="100"/>
       <w:outlineLvl w:val="2"/>
     </w:pPr>
     <w:rPr>
       <w:rFonts w:asciiTheme="majorHAnsi" w:eastAsiaTheme="majorEastAsia" w:hAnsiTheme="majorHAnsi" w:cstheme="majorBidi" w:ascii="Hiragino Sans GB" w:hAnsi="Hiragino Sans GB" w:eastAsia="Hiragino Sans GB"/>
       <w:b/>
       <w:bCs/>
-      <w:color w:val="000000"/>
+      <w:color w:val="20252B"/>
       <w:sz w:val="25"/>
     </w:rPr>
   </w:style>
@@ -2646,10 +2636,10 @@
     <w:rPr>
       <w:rFonts w:asciiTheme="majorHAnsi" w:eastAsiaTheme="majorEastAsia" w:hAnsiTheme="majorHAnsi" w:cstheme="majorBidi" w:ascii="Hiragino Sans GB" w:hAnsi="Hiragino Sans GB" w:eastAsia="Hiragino Sans GB"/>
       <w:b/>
-      <w:color w:val="000000"/>
+      <w:color w:val="20252B"/>
       <w:spacing w:val="5"/>
       <w:kern w:val="28"/>
-      <w:sz w:val="50"/>
+      <w:sz w:val="48"/>
       <w:szCs w:val="52"/>
     </w:rPr>
   </w:style>
@@ -13986,19 +13976,19 @@
     </w:pPr>
     <w:rPr>
       <w:rFonts w:ascii="Hiragino Sans GB" w:hAnsi="Hiragino Sans GB" w:eastAsia="Hiragino Sans GB"/>
-      <w:color w:val="666666"/>
+      <w:color w:val="C85D12"/>
       <w:sz w:val="21"/>
     </w:rPr>
   </w:style>
   <w:style w:type="paragraph" w:customStyle="1" w:styleId="ArticleDigest">
     <w:name w:val="Article Digest"/>
     <w:pPr>
-      <w:spacing w:line="324" w:lineRule="auto" w:after="200"/>
+      <w:spacing w:line="372" w:lineRule="auto" w:after="200"/>
     </w:pPr>
     <w:rPr>
       <w:rFonts w:ascii="Hiragino Sans GB" w:hAnsi="Hiragino Sans GB" w:eastAsia="Hiragino Sans GB"/>
-      <w:i/>
-      <w:color w:val="666666"/>
+      <w:i w:val="0"/>
+      <w:color w:val="595959"/>
       <w:sz w:val="21"/>
     </w:rPr>
   </w:style>

</xml_diff>